<commit_message>
Avance Proyecto Educativo Frontera
</commit_message>
<xml_diff>
--- a/Desarrollo de Producto Basada Norma IEEE-830 STD (Grupo Frontera).docx
+++ b/Desarrollo de Producto Basada Norma IEEE-830 STD (Grupo Frontera).docx
@@ -127,9 +127,11 @@
       <w:r>
         <w:t xml:space="preserve">Proyecto: </w:t>
       </w:r>
+      <w:proofErr w:type="spellStart"/>
       <w:r>
         <w:t>KiSS</w:t>
       </w:r>
+      <w:proofErr w:type="spellEnd"/>
     </w:p>
     <w:p>
       <w:pPr>
@@ -483,7 +485,21 @@
               <w:rPr>
                 <w:b/>
               </w:rPr>
-              <w:t>Verificado dep. calidad.</w:t>
+              <w:t xml:space="preserve">Verificado </w:t>
+            </w:r>
+            <w:proofErr w:type="spellStart"/>
+            <w:r>
+              <w:rPr>
+                <w:b/>
+              </w:rPr>
+              <w:t>dep</w:t>
+            </w:r>
+            <w:proofErr w:type="spellEnd"/>
+            <w:r>
+              <w:rPr>
+                <w:b/>
+              </w:rPr>
+              <w:t>. calidad.</w:t>
             </w:r>
           </w:p>
         </w:tc>
@@ -873,12 +889,21 @@
                 <w:lang w:val="fr-FR"/>
               </w:rPr>
             </w:pPr>
+            <w:proofErr w:type="spellStart"/>
             <w:r>
               <w:rPr>
                 <w:rFonts w:cs="Arial"/>
                 <w:lang w:val="fr-FR"/>
               </w:rPr>
-              <w:t>Por el cliente</w:t>
+              <w:t>Por</w:t>
+            </w:r>
+            <w:proofErr w:type="spellEnd"/>
+            <w:r>
+              <w:rPr>
+                <w:rFonts w:cs="Arial"/>
+                <w:lang w:val="fr-FR"/>
+              </w:rPr>
+              <w:t xml:space="preserve"> el cliente</w:t>
             </w:r>
           </w:p>
         </w:tc>
@@ -899,13 +924,47 @@
                 <w:lang w:val="fr-FR"/>
               </w:rPr>
             </w:pPr>
+            <w:proofErr w:type="spellStart"/>
             <w:r>
               <w:rPr>
                 <w:rFonts w:cs="Arial"/>
                 <w:lang w:val="fr-FR"/>
               </w:rPr>
-              <w:t>Por la empresa suministradora</w:t>
+              <w:t>Por</w:t>
             </w:r>
+            <w:proofErr w:type="spellEnd"/>
+            <w:r>
+              <w:rPr>
+                <w:rFonts w:cs="Arial"/>
+                <w:lang w:val="fr-FR"/>
+              </w:rPr>
+              <w:t xml:space="preserve"> la </w:t>
+            </w:r>
+            <w:proofErr w:type="spellStart"/>
+            <w:r>
+              <w:rPr>
+                <w:rFonts w:cs="Arial"/>
+                <w:lang w:val="fr-FR"/>
+              </w:rPr>
+              <w:t>empresa</w:t>
+            </w:r>
+            <w:proofErr w:type="spellEnd"/>
+            <w:r>
+              <w:rPr>
+                <w:rFonts w:cs="Arial"/>
+                <w:lang w:val="fr-FR"/>
+              </w:rPr>
+              <w:t xml:space="preserve"> </w:t>
+            </w:r>
+            <w:proofErr w:type="spellStart"/>
+            <w:r>
+              <w:rPr>
+                <w:rFonts w:cs="Arial"/>
+                <w:lang w:val="fr-FR"/>
+              </w:rPr>
+              <w:t>suministradora</w:t>
+            </w:r>
+            <w:proofErr w:type="spellEnd"/>
           </w:p>
         </w:tc>
       </w:tr>
@@ -1051,7 +1110,21 @@
               <w:rPr>
                 <w:rFonts w:cs="Arial"/>
               </w:rPr>
-              <w:t xml:space="preserve">Fdo. D./ Dña </w:t>
+              <w:t xml:space="preserve">Fdo. D./ </w:t>
+            </w:r>
+            <w:proofErr w:type="spellStart"/>
+            <w:r>
+              <w:rPr>
+                <w:rFonts w:cs="Arial"/>
+              </w:rPr>
+              <w:t>Dña</w:t>
+            </w:r>
+            <w:proofErr w:type="spellEnd"/>
+            <w:r>
+              <w:rPr>
+                <w:rFonts w:cs="Arial"/>
+              </w:rPr>
+              <w:t xml:space="preserve"> </w:t>
             </w:r>
             <w:r>
               <w:fldChar w:fldCharType="begin"/>
@@ -1092,7 +1165,21 @@
               <w:rPr>
                 <w:rFonts w:cs="Arial"/>
               </w:rPr>
-              <w:t xml:space="preserve">Fdo. D./Dña </w:t>
+              <w:t>Fdo. D./</w:t>
+            </w:r>
+            <w:proofErr w:type="spellStart"/>
+            <w:r>
+              <w:rPr>
+                <w:rFonts w:cs="Arial"/>
+              </w:rPr>
+              <w:t>Dña</w:t>
+            </w:r>
+            <w:proofErr w:type="spellEnd"/>
+            <w:r>
+              <w:rPr>
+                <w:rFonts w:cs="Arial"/>
+              </w:rPr>
+              <w:t xml:space="preserve"> </w:t>
             </w:r>
             <w:r>
               <w:fldChar w:fldCharType="begin"/>
@@ -1265,7 +1352,7 @@
             <w:noProof/>
             <w:webHidden/>
           </w:rPr>
-          <w:t>2</w:t>
+          <w:t>3</w:t>
         </w:r>
         <w:r>
           <w:rPr>
@@ -1339,7 +1426,7 @@
             <w:noProof/>
             <w:webHidden/>
           </w:rPr>
-          <w:t>2</w:t>
+          <w:t>4</w:t>
         </w:r>
         <w:r>
           <w:rPr>
@@ -1433,7 +1520,7 @@
             <w:noProof/>
             <w:webHidden/>
           </w:rPr>
-          <w:t>2</w:t>
+          <w:t>6</w:t>
         </w:r>
         <w:r>
           <w:rPr>
@@ -1523,7 +1610,7 @@
             <w:noProof/>
             <w:webHidden/>
           </w:rPr>
-          <w:t>2</w:t>
+          <w:t>6</w:t>
         </w:r>
         <w:r>
           <w:rPr>
@@ -1613,7 +1700,7 @@
             <w:noProof/>
             <w:webHidden/>
           </w:rPr>
-          <w:t>2</w:t>
+          <w:t>6</w:t>
         </w:r>
         <w:r>
           <w:rPr>
@@ -1703,7 +1790,7 @@
             <w:noProof/>
             <w:webHidden/>
           </w:rPr>
-          <w:t>2</w:t>
+          <w:t>6</w:t>
         </w:r>
         <w:r>
           <w:rPr>
@@ -1793,7 +1880,7 @@
             <w:noProof/>
             <w:webHidden/>
           </w:rPr>
-          <w:t>2</w:t>
+          <w:t>7</w:t>
         </w:r>
         <w:r>
           <w:rPr>
@@ -1883,7 +1970,7 @@
             <w:noProof/>
             <w:webHidden/>
           </w:rPr>
-          <w:t>2</w:t>
+          <w:t>8</w:t>
         </w:r>
         <w:r>
           <w:rPr>
@@ -1973,7 +2060,7 @@
             <w:noProof/>
             <w:webHidden/>
           </w:rPr>
-          <w:t>2</w:t>
+          <w:t>8</w:t>
         </w:r>
         <w:r>
           <w:rPr>
@@ -2067,7 +2154,7 @@
             <w:noProof/>
             <w:webHidden/>
           </w:rPr>
-          <w:t>2</w:t>
+          <w:t>8</w:t>
         </w:r>
         <w:r>
           <w:rPr>
@@ -2157,7 +2244,7 @@
             <w:noProof/>
             <w:webHidden/>
           </w:rPr>
-          <w:t>2</w:t>
+          <w:t>8</w:t>
         </w:r>
         <w:r>
           <w:rPr>
@@ -2247,7 +2334,7 @@
             <w:noProof/>
             <w:webHidden/>
           </w:rPr>
-          <w:t>2</w:t>
+          <w:t>8</w:t>
         </w:r>
         <w:r>
           <w:rPr>
@@ -2337,7 +2424,7 @@
             <w:noProof/>
             <w:webHidden/>
           </w:rPr>
-          <w:t>2</w:t>
+          <w:t>8</w:t>
         </w:r>
         <w:r>
           <w:rPr>
@@ -2427,7 +2514,7 @@
             <w:noProof/>
             <w:webHidden/>
           </w:rPr>
-          <w:t>2</w:t>
+          <w:t>9</w:t>
         </w:r>
         <w:r>
           <w:rPr>
@@ -2517,7 +2604,7 @@
             <w:noProof/>
             <w:webHidden/>
           </w:rPr>
-          <w:t>2</w:t>
+          <w:t>9</w:t>
         </w:r>
         <w:r>
           <w:rPr>
@@ -2607,7 +2694,7 @@
             <w:noProof/>
             <w:webHidden/>
           </w:rPr>
-          <w:t>2</w:t>
+          <w:t>9</w:t>
         </w:r>
         <w:r>
           <w:rPr>
@@ -2701,7 +2788,7 @@
             <w:noProof/>
             <w:webHidden/>
           </w:rPr>
-          <w:t>2</w:t>
+          <w:t>9</w:t>
         </w:r>
         <w:r>
           <w:rPr>
@@ -2791,7 +2878,7 @@
             <w:noProof/>
             <w:webHidden/>
           </w:rPr>
-          <w:t>2</w:t>
+          <w:t>10</w:t>
         </w:r>
         <w:r>
           <w:rPr>
@@ -2877,7 +2964,7 @@
             <w:noProof/>
             <w:webHidden/>
           </w:rPr>
-          <w:t>2</w:t>
+          <w:t>10</w:t>
         </w:r>
         <w:r>
           <w:rPr>
@@ -2963,7 +3050,7 @@
             <w:noProof/>
             <w:webHidden/>
           </w:rPr>
-          <w:t>2</w:t>
+          <w:t>10</w:t>
         </w:r>
         <w:r>
           <w:rPr>
@@ -3051,7 +3138,7 @@
             <w:noProof/>
             <w:webHidden/>
           </w:rPr>
-          <w:t>2</w:t>
+          <w:t>11</w:t>
         </w:r>
         <w:r>
           <w:rPr>
@@ -3137,7 +3224,7 @@
             <w:noProof/>
             <w:webHidden/>
           </w:rPr>
-          <w:t>2</w:t>
+          <w:t>11</w:t>
         </w:r>
         <w:r>
           <w:rPr>
@@ -3227,7 +3314,7 @@
             <w:noProof/>
             <w:webHidden/>
           </w:rPr>
-          <w:t>2</w:t>
+          <w:t>11</w:t>
         </w:r>
         <w:r>
           <w:rPr>
@@ -3649,7 +3736,7 @@
             <w:noProof/>
             <w:webHidden/>
           </w:rPr>
-          <w:t>2</w:t>
+          <w:t>12</w:t>
         </w:r>
         <w:r>
           <w:rPr>
@@ -3735,7 +3822,7 @@
             <w:noProof/>
             <w:webHidden/>
           </w:rPr>
-          <w:t>2</w:t>
+          <w:t>12</w:t>
         </w:r>
         <w:r>
           <w:rPr>
@@ -3821,7 +3908,7 @@
             <w:noProof/>
             <w:webHidden/>
           </w:rPr>
-          <w:t>2</w:t>
+          <w:t>12</w:t>
         </w:r>
         <w:r>
           <w:rPr>
@@ -4073,7 +4160,7 @@
             <w:noProof/>
             <w:webHidden/>
           </w:rPr>
-          <w:t>2</w:t>
+          <w:t>12</w:t>
         </w:r>
         <w:r>
           <w:rPr>
@@ -4247,7 +4334,7 @@
             <w:noProof/>
             <w:webHidden/>
           </w:rPr>
-          <w:t>2</w:t>
+          <w:t>13</w:t>
         </w:r>
         <w:r>
           <w:rPr>
@@ -4373,7 +4460,21 @@
         <w:rPr>
           <w:color w:val="auto"/>
         </w:rPr>
-        <w:t>El propósito del proyecto es que los estudiantes del grupo Frontera implementen los conocimientos adquiridos para desarrollar un sistema automático de apertura y cierre de un portón utilizando comunicación Wi-Fi, programación y máquinas de estados.</w:t>
+        <w:t xml:space="preserve">El propósito del proyecto es que los estudiantes del grupo Frontera implementen los conocimientos adquiridos para desarrollar un sistema automático de apertura y cierre de un portón utilizando comunicación </w:t>
+      </w:r>
+      <w:proofErr w:type="spellStart"/>
+      <w:r>
+        <w:rPr>
+          <w:color w:val="auto"/>
+        </w:rPr>
+        <w:t>Wi</w:t>
+      </w:r>
+      <w:proofErr w:type="spellEnd"/>
+      <w:r>
+        <w:rPr>
+          <w:color w:val="auto"/>
+        </w:rPr>
+        <w:t>-Fi, programación y máquinas de estados.</w:t>
       </w:r>
     </w:p>
     <w:p>
@@ -5645,8 +5746,13 @@
               <w:pStyle w:val="Normalindentado2"/>
               <w:ind w:left="0"/>
             </w:pPr>
+            <w:proofErr w:type="spellStart"/>
             <w:r>
-              <w:t>Johniel Pe</w:t>
+              <w:t>Johniel</w:t>
+            </w:r>
+            <w:proofErr w:type="spellEnd"/>
+            <w:r>
+              <w:t xml:space="preserve"> Pe</w:t>
             </w:r>
             <w:r>
               <w:t>ñ</w:t>
@@ -6376,11 +6482,19 @@
         </w:numPr>
         <w:jc w:val="both"/>
       </w:pPr>
+      <w:proofErr w:type="spellStart"/>
       <w:r>
         <w:rPr>
           <w:rStyle w:val="Strong"/>
         </w:rPr>
-        <w:t>Wi-Fi:</w:t>
+        <w:t>Wi</w:t>
+      </w:r>
+      <w:proofErr w:type="spellEnd"/>
+      <w:r>
+        <w:rPr>
+          <w:rStyle w:val="Strong"/>
+        </w:rPr>
+        <w:t>-Fi:</w:t>
       </w:r>
       <w:r>
         <w:t xml:space="preserve"> Tecnología de comunicación inalámbrica utilizada para enviar y recibir órdenes entre el sistema y el dispositivo de control.</w:t>
@@ -6402,7 +6516,23 @@
         <w:t>PWM:</w:t>
       </w:r>
       <w:r>
-        <w:t xml:space="preserve"> Modulación por Ancho de Pulso (Pulse Width Modulation), utilizada para controlar la velocidad o potencia aplicada al motor.</w:t>
+        <w:t xml:space="preserve"> Modulación por Ancho de Pulso (Pulse </w:t>
+      </w:r>
+      <w:proofErr w:type="spellStart"/>
+      <w:r>
+        <w:t>Width</w:t>
+      </w:r>
+      <w:proofErr w:type="spellEnd"/>
+      <w:r>
+        <w:t xml:space="preserve"> </w:t>
+      </w:r>
+      <w:proofErr w:type="spellStart"/>
+      <w:r>
+        <w:t>Modulation</w:t>
+      </w:r>
+      <w:proofErr w:type="spellEnd"/>
+      <w:r>
+        <w:t>), utilizada para controlar la velocidad o potencia aplicada al motor.</w:t>
       </w:r>
     </w:p>
     <w:p>
@@ -6528,11 +6658,19 @@
         </w:numPr>
         <w:jc w:val="both"/>
       </w:pPr>
+      <w:proofErr w:type="spellStart"/>
       <w:r>
         <w:rPr>
           <w:rStyle w:val="Strong"/>
         </w:rPr>
-        <w:t>Buzzer:</w:t>
+        <w:t>Buzzer</w:t>
+      </w:r>
+      <w:proofErr w:type="spellEnd"/>
+      <w:r>
+        <w:rPr>
+          <w:rStyle w:val="Strong"/>
+        </w:rPr>
+        <w:t>:</w:t>
       </w:r>
       <w:r>
         <w:t xml:space="preserve"> Dispositivo que genera una señal sonora para indicar determinados estados o eventos del sistema.</w:t>
@@ -6879,17 +7017,14 @@
               <w:pStyle w:val="Normalindentado2"/>
               <w:ind w:left="0"/>
             </w:pPr>
-            <w:hyperlink r:id="rId19">
+            <w:hyperlink r:id="rId19" w:history="1">
               <w:r>
                 <w:rPr>
                   <w:rStyle w:val="Hyperlink"/>
                 </w:rPr>
-                <w:t>https://github.com/Johniel-droid/Frontera-Puerton-/blob/master/que%20es%20el%20proyecto.txt</w:t>
+                <w:t>https://github.com/Johniel-droid/Frontera-Puerton-.git</w:t>
               </w:r>
             </w:hyperlink>
-            <w:r>
-              <w:t xml:space="preserve">    </w:t>
-            </w:r>
           </w:p>
         </w:tc>
         <w:tc>
@@ -6930,9 +7065,11 @@
               <w:pStyle w:val="Normalindentado2"/>
               <w:ind w:left="0"/>
             </w:pPr>
+            <w:proofErr w:type="spellStart"/>
             <w:r>
               <w:t>Johniel</w:t>
             </w:r>
+            <w:proofErr w:type="spellEnd"/>
           </w:p>
         </w:tc>
       </w:tr>
@@ -7075,7 +7212,45 @@
           <w:szCs w:val="20"/>
           <w:lang w:val="es-DO" w:eastAsia="es-DO"/>
         </w:rPr>
-        <w:t xml:space="preserve"> será desarrollado como un proyecto con enfoque educativo, utilizando un portón automatizado como ejemplo práctico para aprender y aplicar conceptos de programación, máquinas de estados, control de motores y comunicación Wi-Fi. El sistema permitirá observar de manera práctica cómo interactúan el microcontrolador, los sensores, los actuadores y la comunicación inalámbrica.El proyecto busca que el estudiante tenga la experiencia de </w:t>
+        <w:t xml:space="preserve"> será desarrollado como un proyecto con enfoque educativo, utilizando un portón automatizado como ejemplo práctico para aprender y aplicar conceptos de programación, máquinas de estados, control de motores y comunicación </w:t>
+      </w:r>
+      <w:proofErr w:type="spellStart"/>
+      <w:r>
+        <w:rPr>
+          <w:rFonts w:cs="Arial"/>
+          <w:szCs w:val="20"/>
+          <w:lang w:val="es-DO" w:eastAsia="es-DO"/>
+        </w:rPr>
+        <w:t>Wi</w:t>
+      </w:r>
+      <w:proofErr w:type="spellEnd"/>
+      <w:r>
+        <w:rPr>
+          <w:rFonts w:cs="Arial"/>
+          <w:szCs w:val="20"/>
+          <w:lang w:val="es-DO" w:eastAsia="es-DO"/>
+        </w:rPr>
+        <w:t xml:space="preserve">-Fi. El sistema permitirá observar de manera práctica cómo interactúan el microcontrolador, los sensores, los actuadores y la comunicación </w:t>
+      </w:r>
+      <w:proofErr w:type="spellStart"/>
+      <w:proofErr w:type="gramStart"/>
+      <w:r>
+        <w:rPr>
+          <w:rFonts w:cs="Arial"/>
+          <w:szCs w:val="20"/>
+          <w:lang w:val="es-DO" w:eastAsia="es-DO"/>
+        </w:rPr>
+        <w:t>inalámbrica.El</w:t>
+      </w:r>
+      <w:proofErr w:type="spellEnd"/>
+      <w:proofErr w:type="gramEnd"/>
+      <w:r>
+        <w:rPr>
+          <w:rFonts w:cs="Arial"/>
+          <w:szCs w:val="20"/>
+          <w:lang w:val="es-DO" w:eastAsia="es-DO"/>
+        </w:rPr>
+        <w:t xml:space="preserve"> proyecto busca que el estudiante tenga la experiencia de </w:t>
       </w:r>
       <w:r>
         <w:rPr>
@@ -7125,7 +7300,15 @@
         <w:pStyle w:val="Normalindentado2"/>
       </w:pPr>
       <w:r>
-        <w:t>Frontera será desarrollado como un proyecto con enfoque educativo, utilizando un portón automatizado como ejemplo práctico para aprender y aplicar conceptos de programación, máquinas de estados, control de motores y comunicación Wi-Fi. El sistema permitirá observar de manera práctica cómo interactúan el microcontrolador, sensores, actuadores y comunicación inalámbrica.</w:t>
+        <w:t xml:space="preserve">Frontera será desarrollado como un proyecto con enfoque educativo, utilizando un portón automatizado como ejemplo práctico para aprender y aplicar conceptos de programación, máquinas de estados, control de motores y comunicación </w:t>
+      </w:r>
+      <w:proofErr w:type="spellStart"/>
+      <w:r>
+        <w:t>Wi</w:t>
+      </w:r>
+      <w:proofErr w:type="spellEnd"/>
+      <w:r>
+        <w:t>-Fi. El sistema permitirá observar de manera práctica cómo interactúan el microcontrolador, sensores, actuadores y comunicación inalámbrica.</w:t>
       </w:r>
     </w:p>
     <w:p>
@@ -7172,7 +7355,39 @@
           <w:iCs/>
           <w:color w:val="auto"/>
         </w:rPr>
-        <w:t>l portón podrá recibir una orden por Wi-Fi o mediante las botoneras, abrirá o cerrará usando el motor, se detendrá al llegar a sus límites y utilizará la fotocelda para evitar un cierre cuando haya algo en el paso. Las luces y el buzzer indicarán lo que está ocurriendo.</w:t>
+        <w:t xml:space="preserve">l portón podrá recibir una orden por </w:t>
+      </w:r>
+      <w:proofErr w:type="spellStart"/>
+      <w:r>
+        <w:rPr>
+          <w:iCs/>
+          <w:color w:val="auto"/>
+        </w:rPr>
+        <w:t>Wi</w:t>
+      </w:r>
+      <w:proofErr w:type="spellEnd"/>
+      <w:r>
+        <w:rPr>
+          <w:iCs/>
+          <w:color w:val="auto"/>
+        </w:rPr>
+        <w:t xml:space="preserve">-Fi o mediante las botoneras, abrirá o cerrará usando el motor, se detendrá al llegar a sus límites y utilizará la fotocelda para evitar un cierre cuando haya algo en el paso. Las luces y el </w:t>
+      </w:r>
+      <w:proofErr w:type="spellStart"/>
+      <w:r>
+        <w:rPr>
+          <w:iCs/>
+          <w:color w:val="auto"/>
+        </w:rPr>
+        <w:t>buzzer</w:t>
+      </w:r>
+      <w:proofErr w:type="spellEnd"/>
+      <w:r>
+        <w:rPr>
+          <w:iCs/>
+          <w:color w:val="auto"/>
+        </w:rPr>
+        <w:t xml:space="preserve"> indicarán lo que está ocurriendo.</w:t>
       </w:r>
     </w:p>
     <w:p>
@@ -7242,7 +7457,23 @@
           <w:iCs/>
           <w:color w:val="auto"/>
         </w:rPr>
-        <w:t>Detección de posición: utiliza limit switches para detectar cuándo el portón ha llegado completamente abierto o cerrado y detener el motor.</w:t>
+        <w:t xml:space="preserve">Detección de posición: utiliza </w:t>
+      </w:r>
+      <w:proofErr w:type="spellStart"/>
+      <w:r>
+        <w:rPr>
+          <w:iCs/>
+          <w:color w:val="auto"/>
+        </w:rPr>
+        <w:t>limit</w:t>
+      </w:r>
+      <w:proofErr w:type="spellEnd"/>
+      <w:r>
+        <w:rPr>
+          <w:iCs/>
+          <w:color w:val="auto"/>
+        </w:rPr>
+        <w:t xml:space="preserve"> switches para detectar cuándo el portón ha llegado completamente abierto o cerrado y detener el motor.</w:t>
       </w:r>
     </w:p>
     <w:p>
@@ -7521,8 +7752,13 @@
               <w:ind w:left="0"/>
             </w:pPr>
             <w:r>
-              <w:t>Habilitador que utilizara el proyecto de manera pedagógica..</w:t>
+              <w:t xml:space="preserve">Habilitador que utilizara el proyecto de manera </w:t>
             </w:r>
+            <w:proofErr w:type="gramStart"/>
+            <w:r>
+              <w:t>pedagógica..</w:t>
+            </w:r>
+            <w:proofErr w:type="gramEnd"/>
           </w:p>
         </w:tc>
       </w:tr>
@@ -7558,7 +7794,35 @@
         <w:rPr>
           <w:szCs w:val="20"/>
         </w:rPr>
-        <w:t>El proyecto Frontera estará limitado a los recursos y componentes disponibles para su desarrollo, incluyendo el microcontrolador, motor, sensores de límite, fotocelda, botones, buzzer y luces indicadoras. Además, el sistema deberá utilizar comunicación Wi-Fi y una máquina de estados para controlar el funcionamiento del portón.</w:t>
+        <w:t xml:space="preserve">El proyecto Frontera estará limitado a los recursos y componentes disponibles para su desarrollo, incluyendo el microcontrolador, motor, sensores de límite, fotocelda, botones, </w:t>
+      </w:r>
+      <w:proofErr w:type="spellStart"/>
+      <w:r>
+        <w:rPr>
+          <w:szCs w:val="20"/>
+        </w:rPr>
+        <w:t>buzzer</w:t>
+      </w:r>
+      <w:proofErr w:type="spellEnd"/>
+      <w:r>
+        <w:rPr>
+          <w:szCs w:val="20"/>
+        </w:rPr>
+        <w:t xml:space="preserve"> y luces indicadoras. Además, el sistema deberá utilizar comunicación </w:t>
+      </w:r>
+      <w:proofErr w:type="spellStart"/>
+      <w:r>
+        <w:rPr>
+          <w:szCs w:val="20"/>
+        </w:rPr>
+        <w:t>Wi</w:t>
+      </w:r>
+      <w:proofErr w:type="spellEnd"/>
+      <w:r>
+        <w:rPr>
+          <w:szCs w:val="20"/>
+        </w:rPr>
+        <w:t>-Fi y una máquina de estados para controlar el funcionamiento del portón.</w:t>
       </w:r>
       <w:r>
         <w:rPr>
@@ -7588,7 +7852,15 @@
         <w:jc w:val="both"/>
       </w:pPr>
       <w:r>
-        <w:t>Los componentes principales del proyecto Frontera funcionarán correctamente durante su operación. El sistema dependerá del funcionamiento del microcontrolador, motor, sensores, fuente de alimentación y comunicación Wi-Fi para poder realizar correctamente la apertura y cierre del portón.</w:t>
+        <w:t xml:space="preserve">Los componentes principales del proyecto Frontera funcionarán correctamente durante su operación. El sistema dependerá del funcionamiento del microcontrolador, motor, sensores, fuente de alimentación y comunicación </w:t>
+      </w:r>
+      <w:proofErr w:type="spellStart"/>
+      <w:r>
+        <w:t>Wi</w:t>
+      </w:r>
+      <w:proofErr w:type="spellEnd"/>
+      <w:r>
+        <w:t>-Fi para poder realizar correctamente la apertura y cierre del portón.</w:t>
       </w:r>
     </w:p>
     <w:p>
@@ -7603,7 +7875,15 @@
         <w:jc w:val="both"/>
       </w:pPr>
       <w:r>
-        <w:t>Si alguno de estos elementos presenta una falla, como la pérdida de conexión Wi-Fi, un sensor que no detecte la posición del portón, una falla en el motor o una alimentación eléctrica insuficiente, el funcionamiento del sistema podría verse afectado. Por esta razón, se deberá comprobar el correcto funcionamiento de cada componente antes de realizar las pruebas finales del proyecto.</w:t>
+        <w:t xml:space="preserve">Si alguno de estos elementos presenta una falla, como la pérdida de conexión </w:t>
+      </w:r>
+      <w:proofErr w:type="spellStart"/>
+      <w:r>
+        <w:t>Wi</w:t>
+      </w:r>
+      <w:proofErr w:type="spellEnd"/>
+      <w:r>
+        <w:t>-Fi, un sensor que no detecte la posición del portón, una falla en el motor o una alimentación eléctrica insuficiente, el funcionamiento del sistema podría verse afectado. Por esta razón, se deberá comprobar el correcto funcionamiento de cada componente antes de realizar las pruebas finales del proyecto.</w:t>
       </w:r>
     </w:p>
     <w:p>
@@ -7688,7 +7968,15 @@
         <w:t>Frontera</w:t>
       </w:r>
       <w:r>
-        <w:t xml:space="preserve"> será desarrollado como un proyecto con enfoque educativo, utilizando un portón automatizado como ejemplo práctico para aprender y aplicar conceptos de programación, máquinas de estados, control de motores y comunicación Wi-Fi. El sistema permitirá observar de manera práctica cómo interactúan el microcontrolador, los sensores, los actuadores y la comunicación inalámbrica.</w:t>
+        <w:t xml:space="preserve"> será desarrollado como un proyecto con enfoque educativo, utilizando un portón automatizado como ejemplo práctico para aprender y aplicar conceptos de programación, máquinas de estados, control de motores y comunicación </w:t>
+      </w:r>
+      <w:proofErr w:type="spellStart"/>
+      <w:r>
+        <w:t>Wi</w:t>
+      </w:r>
+      <w:proofErr w:type="spellEnd"/>
+      <w:r>
+        <w:t>-Fi. El sistema permitirá observar de manera práctica cómo interactúan el microcontrolador, los sensores, los actuadores y la comunicación inalámbrica.</w:t>
       </w:r>
     </w:p>
     <w:p>
@@ -7831,7 +8119,15 @@
         <w:t>RF 1:</w:t>
       </w:r>
       <w:r>
-        <w:t xml:space="preserve"> El sistema debe abrir el portón al recibir la orden (botón físico o comando Wi-Fi) cuando esté cerrado.</w:t>
+        <w:t xml:space="preserve"> El sistema debe abrir el portón al recibir la orden (botón físico o comando </w:t>
+      </w:r>
+      <w:proofErr w:type="spellStart"/>
+      <w:r>
+        <w:t>Wi</w:t>
+      </w:r>
+      <w:proofErr w:type="spellEnd"/>
+      <w:r>
+        <w:t>-Fi) cuando esté cerrado.</w:t>
       </w:r>
     </w:p>
     <w:p>
@@ -7995,7 +8291,15 @@
         </w:rPr>
       </w:pPr>
       <w:r>
-        <w:t>El sistema deberá permitir al usuario controlar las funciones principales del portón mediante un dispositivo móvil conectado a la red Wi-Fi. El usuario podrá enviar órdenes para abrir, cerrar o detener el movimiento del portón</w:t>
+        <w:t xml:space="preserve">El sistema deberá permitir al usuario controlar las funciones principales del portón mediante un dispositivo móvil conectado a la red </w:t>
+      </w:r>
+      <w:proofErr w:type="spellStart"/>
+      <w:r>
+        <w:t>Wi</w:t>
+      </w:r>
+      <w:proofErr w:type="spellEnd"/>
+      <w:r>
+        <w:t>-Fi. El usuario podrá enviar órdenes para abrir, cerrar o detener el movimiento del portón</w:t>
       </w:r>
       <w:r>
         <w:rPr>
@@ -8216,11 +8520,19 @@
           <w:lang w:val="es-DO"/>
         </w:rPr>
       </w:pPr>
+      <w:proofErr w:type="spellStart"/>
       <w:r>
         <w:rPr>
           <w:lang w:val="es-DO"/>
         </w:rPr>
-        <w:t>Buzzer.</w:t>
+        <w:t>Buzzer</w:t>
+      </w:r>
+      <w:proofErr w:type="spellEnd"/>
+      <w:r>
+        <w:rPr>
+          <w:lang w:val="es-DO"/>
+        </w:rPr>
+        <w:t>.</w:t>
       </w:r>
     </w:p>
     <w:p>
@@ -8334,7 +8646,21 @@
         <w:rPr>
           <w:lang w:val="es-DO"/>
         </w:rPr>
-        <w:t>El programa deberá interpretar las órdenes recibidas mediante Wi-Fi y las señales provenientes de las botoneras y sensores para determinar la acción correspondiente.</w:t>
+        <w:t xml:space="preserve">El programa deberá interpretar las órdenes recibidas mediante </w:t>
+      </w:r>
+      <w:proofErr w:type="spellStart"/>
+      <w:r>
+        <w:rPr>
+          <w:lang w:val="es-DO"/>
+        </w:rPr>
+        <w:t>Wi</w:t>
+      </w:r>
+      <w:proofErr w:type="spellEnd"/>
+      <w:r>
+        <w:rPr>
+          <w:lang w:val="es-DO"/>
+        </w:rPr>
+        <w:t>-Fi y las señales provenientes de las botoneras y sensores para determinar la acción correspondiente.</w:t>
       </w:r>
     </w:p>
     <w:p>
@@ -8391,7 +8717,27 @@
           <w:color w:val="000000"/>
           <w:lang w:val="es-DO"/>
         </w:rPr>
-        <w:t>La comunicación entre el sistema y el dispositivo de control se realizará mediante Wi-Fi.</w:t>
+        <w:t xml:space="preserve">La comunicación entre el sistema y el dispositivo de control se realizará mediante </w:t>
+      </w:r>
+      <w:proofErr w:type="spellStart"/>
+      <w:r>
+        <w:rPr>
+          <w:i w:val="0"/>
+          <w:iCs/>
+          <w:color w:val="000000"/>
+          <w:lang w:val="es-DO"/>
+        </w:rPr>
+        <w:t>Wi</w:t>
+      </w:r>
+      <w:proofErr w:type="spellEnd"/>
+      <w:r>
+        <w:rPr>
+          <w:i w:val="0"/>
+          <w:iCs/>
+          <w:color w:val="000000"/>
+          <w:lang w:val="es-DO"/>
+        </w:rPr>
+        <w:t>-Fi.</w:t>
       </w:r>
     </w:p>
     <w:p>
@@ -13338,6 +13684,28 @@
       <w:bCs/>
     </w:rPr>
   </w:style>
+  <w:style w:type="character" w:styleId="FollowedHyperlink">
+    <w:name w:val="FollowedHyperlink"/>
+    <w:uiPriority w:val="99"/>
+    <w:semiHidden/>
+    <w:unhideWhenUsed/>
+    <w:rsid w:val="00D70840"/>
+    <w:rPr>
+      <w:color w:val="954F72"/>
+      <w:u w:val="single"/>
+    </w:rPr>
+  </w:style>
+  <w:style w:type="character" w:styleId="UnresolvedMention">
+    <w:name w:val="Unresolved Mention"/>
+    <w:uiPriority w:val="99"/>
+    <w:semiHidden/>
+    <w:unhideWhenUsed/>
+    <w:rsid w:val="00D70840"/>
+    <w:rPr>
+      <w:color w:val="605E5C"/>
+      <w:shd w:val="clear" w:color="auto" w:fill="E1DFDD"/>
+    </w:rPr>
+  </w:style>
 </w:styles>
 </file>
 

</xml_diff>